<commit_message>
Update FileExplorer user manual
Co-Authored-By: Claude Sonnet 4.6 <noreply@anthropic.com>
</commit_message>
<xml_diff>
--- a/FileExplorer_UserManual.docx
+++ b/FileExplorer_UserManual.docx
@@ -95,12 +95,6 @@
         <w:gridCol w:w="6960"/>
       </w:tblGrid>
       <w:tr>
-        <w:tblPrEx>
-          <w:tblCellMar>
-            <w:top w:w="0" w:type="dxa"/>
-            <w:bottom w:w="0" w:type="dxa"/>
-          </w:tblCellMar>
-        </w:tblPrEx>
         <w:tc>
           <w:tcPr>
             <w:tcW w:w="2400" w:type="dxa"/>
@@ -163,12 +157,6 @@
         </w:tc>
       </w:tr>
       <w:tr>
-        <w:tblPrEx>
-          <w:tblCellMar>
-            <w:top w:w="0" w:type="dxa"/>
-            <w:bottom w:w="0" w:type="dxa"/>
-          </w:tblCellMar>
-        </w:tblPrEx>
         <w:tc>
           <w:tcPr>
             <w:tcW w:w="2400" w:type="dxa"/>
@@ -227,12 +215,6 @@
         </w:tc>
       </w:tr>
       <w:tr>
-        <w:tblPrEx>
-          <w:tblCellMar>
-            <w:top w:w="0" w:type="dxa"/>
-            <w:bottom w:w="0" w:type="dxa"/>
-          </w:tblCellMar>
-        </w:tblPrEx>
         <w:tc>
           <w:tcPr>
             <w:tcW w:w="2400" w:type="dxa"/>
@@ -291,12 +273,6 @@
         </w:tc>
       </w:tr>
       <w:tr>
-        <w:tblPrEx>
-          <w:tblCellMar>
-            <w:top w:w="0" w:type="dxa"/>
-            <w:bottom w:w="0" w:type="dxa"/>
-          </w:tblCellMar>
-        </w:tblPrEx>
         <w:tc>
           <w:tcPr>
             <w:tcW w:w="2400" w:type="dxa"/>
@@ -355,12 +331,6 @@
         </w:tc>
       </w:tr>
       <w:tr>
-        <w:tblPrEx>
-          <w:tblCellMar>
-            <w:top w:w="0" w:type="dxa"/>
-            <w:bottom w:w="0" w:type="dxa"/>
-          </w:tblCellMar>
-        </w:tblPrEx>
         <w:tc>
           <w:tcPr>
             <w:tcW w:w="2400" w:type="dxa"/>
@@ -435,12 +405,6 @@
         </w:tc>
       </w:tr>
       <w:tr>
-        <w:tblPrEx>
-          <w:tblCellMar>
-            <w:top w:w="0" w:type="dxa"/>
-            <w:bottom w:w="0" w:type="dxa"/>
-          </w:tblCellMar>
-        </w:tblPrEx>
         <w:tc>
           <w:tcPr>
             <w:tcW w:w="2400" w:type="dxa"/>
@@ -5074,11 +5038,9 @@
       <w:r>
         <w:t xml:space="preserve">Double-click any file in the </w:t>
       </w:r>
-      <w:proofErr w:type="gramStart"/>
-      <w:r>
-        <w:t>list, or</w:t>
-      </w:r>
-      <w:proofErr w:type="gramEnd"/>
+      <w:r>
+        <w:t>list or</w:t>
+      </w:r>
       <w:r>
         <w:t xml:space="preserve"> select it and press Enter. The file opens with its registered default application.</w:t>
       </w:r>
@@ -5103,11 +5065,9 @@
       <w:r>
         <w:t xml:space="preserve">Type a pattern in the Filter box on the toolbar (for example *.pdf) to show only matching files. Use semicolons to combine patterns: </w:t>
       </w:r>
-      <w:proofErr w:type="gramStart"/>
-      <w:r>
-        <w:t>*.pdf;*.docx</w:t>
-      </w:r>
-      <w:proofErr w:type="gramEnd"/>
+      <w:r>
+        <w:t>*.pdf; *.docx</w:t>
+      </w:r>
       <w:r>
         <w:t>. Clear the box to restore the full view.</w:t>
       </w:r>
@@ -5131,11 +5091,9 @@
       <w:r>
         <w:t xml:space="preserve">Select an item and press F2 to rename it </w:t>
       </w:r>
-      <w:proofErr w:type="gramStart"/>
-      <w:r>
-        <w:t>inline, or</w:t>
-      </w:r>
-      <w:proofErr w:type="gramEnd"/>
+      <w:r>
+        <w:t>inline or</w:t>
+      </w:r>
       <w:r>
         <w:t xml:space="preserve"> press Del to send it to the Recycle Bin. Right-clicking reveals the full context menu with additional options.</w:t>
       </w:r>
@@ -5166,12 +5124,6 @@
         <w:gridCol w:w="9360"/>
       </w:tblGrid>
       <w:tr>
-        <w:tblPrEx>
-          <w:tblCellMar>
-            <w:top w:w="0" w:type="dxa"/>
-            <w:bottom w:w="0" w:type="dxa"/>
-          </w:tblCellMar>
-        </w:tblPrEx>
         <w:tc>
           <w:tcPr>
             <w:tcW w:w="9360" w:type="dxa"/>
@@ -5265,11 +5217,9 @@
       <w:r>
         <w:t>Refresh button (labeled ⟳ Refresh [F5</w:t>
       </w:r>
-      <w:proofErr w:type="gramStart"/>
-      <w:r>
-        <w:t>]) —</w:t>
-      </w:r>
-      <w:proofErr w:type="gramEnd"/>
+      <w:r>
+        <w:t>])</w:t>
+      </w:r>
       <w:r>
         <w:t xml:space="preserve"> reloads all drives, restarts background scanning, and repopulates the current folder. Equivalent to pressing F5.</w:t>
       </w:r>
@@ -5289,7 +5239,13 @@
         <w:spacing w:after="60"/>
       </w:pPr>
       <w:r>
-        <w:t xml:space="preserve">Filter box (labeled Filter:) — accepts one or more wildcard patterns. Apply a filter by typing in this box. Results update approximately 350 </w:t>
+        <w:t>Filter box (labeled Filter:)</w:t>
+      </w:r>
+      <w:r>
+        <w:t xml:space="preserve"> </w:t>
+      </w:r>
+      <w:r>
+        <w:t xml:space="preserve">accepts one or more wildcard patterns. Apply a filter by typing in this box. Results update approximately 350 </w:t>
       </w:r>
       <w:proofErr w:type="spellStart"/>
       <w:r>
@@ -5347,12 +5303,6 @@
         <w:gridCol w:w="7560"/>
       </w:tblGrid>
       <w:tr>
-        <w:tblPrEx>
-          <w:tblCellMar>
-            <w:top w:w="0" w:type="dxa"/>
-            <w:bottom w:w="0" w:type="dxa"/>
-          </w:tblCellMar>
-        </w:tblPrEx>
         <w:tc>
           <w:tcPr>
             <w:tcW w:w="1800" w:type="dxa"/>
@@ -5415,12 +5365,6 @@
         </w:tc>
       </w:tr>
       <w:tr>
-        <w:tblPrEx>
-          <w:tblCellMar>
-            <w:top w:w="0" w:type="dxa"/>
-            <w:bottom w:w="0" w:type="dxa"/>
-          </w:tblCellMar>
-        </w:tblPrEx>
         <w:tc>
           <w:tcPr>
             <w:tcW w:w="1800" w:type="dxa"/>
@@ -5479,12 +5423,6 @@
         </w:tc>
       </w:tr>
       <w:tr>
-        <w:tblPrEx>
-          <w:tblCellMar>
-            <w:top w:w="0" w:type="dxa"/>
-            <w:bottom w:w="0" w:type="dxa"/>
-          </w:tblCellMar>
-        </w:tblPrEx>
         <w:tc>
           <w:tcPr>
             <w:tcW w:w="1800" w:type="dxa"/>
@@ -5543,12 +5481,6 @@
         </w:tc>
       </w:tr>
       <w:tr>
-        <w:tblPrEx>
-          <w:tblCellMar>
-            <w:top w:w="0" w:type="dxa"/>
-            <w:bottom w:w="0" w:type="dxa"/>
-          </w:tblCellMar>
-        </w:tblPrEx>
         <w:tc>
           <w:tcPr>
             <w:tcW w:w="1800" w:type="dxa"/>
@@ -5607,12 +5539,6 @@
         </w:tc>
       </w:tr>
       <w:tr>
-        <w:tblPrEx>
-          <w:tblCellMar>
-            <w:top w:w="0" w:type="dxa"/>
-            <w:bottom w:w="0" w:type="dxa"/>
-          </w:tblCellMar>
-        </w:tblPrEx>
         <w:tc>
           <w:tcPr>
             <w:tcW w:w="1800" w:type="dxa"/>
@@ -5827,12 +5753,6 @@
         <w:gridCol w:w="7560"/>
       </w:tblGrid>
       <w:tr>
-        <w:tblPrEx>
-          <w:tblCellMar>
-            <w:top w:w="0" w:type="dxa"/>
-            <w:bottom w:w="0" w:type="dxa"/>
-          </w:tblCellMar>
-        </w:tblPrEx>
         <w:tc>
           <w:tcPr>
             <w:tcW w:w="1800" w:type="dxa"/>
@@ -5895,12 +5815,6 @@
         </w:tc>
       </w:tr>
       <w:tr>
-        <w:tblPrEx>
-          <w:tblCellMar>
-            <w:top w:w="0" w:type="dxa"/>
-            <w:bottom w:w="0" w:type="dxa"/>
-          </w:tblCellMar>
-        </w:tblPrEx>
         <w:tc>
           <w:tcPr>
             <w:tcW w:w="1800" w:type="dxa"/>
@@ -5960,12 +5874,6 @@
         </w:tc>
       </w:tr>
       <w:tr>
-        <w:tblPrEx>
-          <w:tblCellMar>
-            <w:top w:w="0" w:type="dxa"/>
-            <w:bottom w:w="0" w:type="dxa"/>
-          </w:tblCellMar>
-        </w:tblPrEx>
         <w:tc>
           <w:tcPr>
             <w:tcW w:w="1800" w:type="dxa"/>
@@ -6066,12 +5974,6 @@
         </w:tc>
       </w:tr>
       <w:tr>
-        <w:tblPrEx>
-          <w:tblCellMar>
-            <w:top w:w="0" w:type="dxa"/>
-            <w:bottom w:w="0" w:type="dxa"/>
-          </w:tblCellMar>
-        </w:tblPrEx>
         <w:tc>
           <w:tcPr>
             <w:tcW w:w="1800" w:type="dxa"/>
@@ -6131,12 +6033,6 @@
         </w:tc>
       </w:tr>
       <w:tr>
-        <w:tblPrEx>
-          <w:tblCellMar>
-            <w:top w:w="0" w:type="dxa"/>
-            <w:bottom w:w="0" w:type="dxa"/>
-          </w:tblCellMar>
-        </w:tblPrEx>
         <w:tc>
           <w:tcPr>
             <w:tcW w:w="1800" w:type="dxa"/>
@@ -7100,12 +6996,6 @@
         <w:gridCol w:w="7560"/>
       </w:tblGrid>
       <w:tr>
-        <w:tblPrEx>
-          <w:tblCellMar>
-            <w:top w:w="0" w:type="dxa"/>
-            <w:bottom w:w="0" w:type="dxa"/>
-          </w:tblCellMar>
-        </w:tblPrEx>
         <w:tc>
           <w:tcPr>
             <w:tcW w:w="1800" w:type="dxa"/>
@@ -7168,12 +7058,6 @@
         </w:tc>
       </w:tr>
       <w:tr>
-        <w:tblPrEx>
-          <w:tblCellMar>
-            <w:top w:w="0" w:type="dxa"/>
-            <w:bottom w:w="0" w:type="dxa"/>
-          </w:tblCellMar>
-        </w:tblPrEx>
         <w:tc>
           <w:tcPr>
             <w:tcW w:w="1800" w:type="dxa"/>
@@ -7232,12 +7116,6 @@
         </w:tc>
       </w:tr>
       <w:tr>
-        <w:tblPrEx>
-          <w:tblCellMar>
-            <w:top w:w="0" w:type="dxa"/>
-            <w:bottom w:w="0" w:type="dxa"/>
-          </w:tblCellMar>
-        </w:tblPrEx>
         <w:tc>
           <w:tcPr>
             <w:tcW w:w="1800" w:type="dxa"/>
@@ -7296,12 +7174,6 @@
         </w:tc>
       </w:tr>
       <w:tr>
-        <w:tblPrEx>
-          <w:tblCellMar>
-            <w:top w:w="0" w:type="dxa"/>
-            <w:bottom w:w="0" w:type="dxa"/>
-          </w:tblCellMar>
-        </w:tblPrEx>
         <w:tc>
           <w:tcPr>
             <w:tcW w:w="1800" w:type="dxa"/>
@@ -7531,7 +7403,6 @@
         <w:spacing w:after="80"/>
         <w:ind w:left="360"/>
       </w:pPr>
-      <w:proofErr w:type="gramStart"/>
       <w:r>
         <w:rPr>
           <w:rFonts w:ascii="Consolas" w:eastAsia="Consolas" w:hAnsi="Consolas" w:cs="Consolas"/>
@@ -7541,9 +7412,8 @@
           <w:sz w:val="20"/>
           <w:szCs w:val="20"/>
         </w:rPr>
-        <w:t>*.log;*.txt</w:t>
-      </w:r>
-      <w:proofErr w:type="gramEnd"/>
+        <w:t>*.log; *.txt</w:t>
+      </w:r>
       <w:r>
         <w:rPr>
           <w:color w:val="404040"/>
@@ -7558,7 +7428,6 @@
         <w:spacing w:after="80"/>
         <w:ind w:left="360"/>
       </w:pPr>
-      <w:proofErr w:type="gramStart"/>
       <w:r>
         <w:rPr>
           <w:rFonts w:ascii="Consolas" w:eastAsia="Consolas" w:hAnsi="Consolas" w:cs="Consolas"/>
@@ -7570,15 +7439,6 @@
         </w:rPr>
         <w:t>report*</w:t>
       </w:r>
-      <w:r>
-        <w:rPr>
-          <w:color w:val="404040"/>
-          <w:sz w:val="20"/>
-          <w:szCs w:val="20"/>
-        </w:rPr>
-        <w:t xml:space="preserve"> —</w:t>
-      </w:r>
-      <w:proofErr w:type="gramEnd"/>
       <w:r>
         <w:rPr>
           <w:color w:val="404040"/>
@@ -7916,12 +7776,6 @@
         <w:gridCol w:w="9360"/>
       </w:tblGrid>
       <w:tr>
-        <w:tblPrEx>
-          <w:tblCellMar>
-            <w:top w:w="0" w:type="dxa"/>
-            <w:bottom w:w="0" w:type="dxa"/>
-          </w:tblCellMar>
-        </w:tblPrEx>
         <w:tc>
           <w:tcPr>
             <w:tcW w:w="9360" w:type="dxa"/>
@@ -7969,10 +7823,7 @@
     </w:p>
     <w:p>
       <w:r>
-        <w:t>Right clicking</w:t>
-      </w:r>
-      <w:r>
-        <w:t xml:space="preserve"> any item in the file list opens a context menu with the following options:</w:t>
+        <w:t>Right clicking any item in the file list opens a context menu with the following options:</w:t>
       </w:r>
     </w:p>
     <w:p>
@@ -8002,12 +7853,6 @@
         <w:gridCol w:w="6960"/>
       </w:tblGrid>
       <w:tr>
-        <w:tblPrEx>
-          <w:tblCellMar>
-            <w:top w:w="0" w:type="dxa"/>
-            <w:bottom w:w="0" w:type="dxa"/>
-          </w:tblCellMar>
-        </w:tblPrEx>
         <w:tc>
           <w:tcPr>
             <w:tcW w:w="2400" w:type="dxa"/>
@@ -8070,12 +7915,6 @@
         </w:tc>
       </w:tr>
       <w:tr>
-        <w:tblPrEx>
-          <w:tblCellMar>
-            <w:top w:w="0" w:type="dxa"/>
-            <w:bottom w:w="0" w:type="dxa"/>
-          </w:tblCellMar>
-        </w:tblPrEx>
         <w:tc>
           <w:tcPr>
             <w:tcW w:w="2400" w:type="dxa"/>
@@ -8150,12 +7989,6 @@
         </w:tc>
       </w:tr>
       <w:tr>
-        <w:tblPrEx>
-          <w:tblCellMar>
-            <w:top w:w="0" w:type="dxa"/>
-            <w:bottom w:w="0" w:type="dxa"/>
-          </w:tblCellMar>
-        </w:tblPrEx>
         <w:tc>
           <w:tcPr>
             <w:tcW w:w="2400" w:type="dxa"/>
@@ -8215,12 +8048,6 @@
         </w:tc>
       </w:tr>
       <w:tr>
-        <w:tblPrEx>
-          <w:tblCellMar>
-            <w:top w:w="0" w:type="dxa"/>
-            <w:bottom w:w="0" w:type="dxa"/>
-          </w:tblCellMar>
-        </w:tblPrEx>
         <w:tc>
           <w:tcPr>
             <w:tcW w:w="2400" w:type="dxa"/>
@@ -8280,12 +8107,6 @@
         </w:tc>
       </w:tr>
       <w:tr>
-        <w:tblPrEx>
-          <w:tblCellMar>
-            <w:top w:w="0" w:type="dxa"/>
-            <w:bottom w:w="0" w:type="dxa"/>
-          </w:tblCellMar>
-        </w:tblPrEx>
         <w:tc>
           <w:tcPr>
             <w:tcW w:w="2400" w:type="dxa"/>
@@ -8345,12 +8166,6 @@
         </w:tc>
       </w:tr>
       <w:tr>
-        <w:tblPrEx>
-          <w:tblCellMar>
-            <w:top w:w="0" w:type="dxa"/>
-            <w:bottom w:w="0" w:type="dxa"/>
-          </w:tblCellMar>
-        </w:tblPrEx>
         <w:tc>
           <w:tcPr>
             <w:tcW w:w="2400" w:type="dxa"/>
@@ -8410,12 +8225,6 @@
         </w:tc>
       </w:tr>
       <w:tr>
-        <w:tblPrEx>
-          <w:tblCellMar>
-            <w:top w:w="0" w:type="dxa"/>
-            <w:bottom w:w="0" w:type="dxa"/>
-          </w:tblCellMar>
-        </w:tblPrEx>
         <w:tc>
           <w:tcPr>
             <w:tcW w:w="2400" w:type="dxa"/>
@@ -8762,12 +8571,6 @@
         <w:gridCol w:w="9360"/>
       </w:tblGrid>
       <w:tr>
-        <w:tblPrEx>
-          <w:tblCellMar>
-            <w:top w:w="0" w:type="dxa"/>
-            <w:bottom w:w="0" w:type="dxa"/>
-          </w:tblCellMar>
-        </w:tblPrEx>
         <w:tc>
           <w:tcPr>
             <w:tcW w:w="9360" w:type="dxa"/>
@@ -8960,12 +8763,6 @@
         <w:gridCol w:w="6560"/>
       </w:tblGrid>
       <w:tr>
-        <w:tblPrEx>
-          <w:tblCellMar>
-            <w:top w:w="0" w:type="dxa"/>
-            <w:bottom w:w="0" w:type="dxa"/>
-          </w:tblCellMar>
-        </w:tblPrEx>
         <w:tc>
           <w:tcPr>
             <w:tcW w:w="2800" w:type="dxa"/>
@@ -9028,12 +8825,6 @@
         </w:tc>
       </w:tr>
       <w:tr>
-        <w:tblPrEx>
-          <w:tblCellMar>
-            <w:top w:w="0" w:type="dxa"/>
-            <w:bottom w:w="0" w:type="dxa"/>
-          </w:tblCellMar>
-        </w:tblPrEx>
         <w:tc>
           <w:tcPr>
             <w:tcW w:w="2800" w:type="dxa"/>
@@ -9093,12 +8884,6 @@
         </w:tc>
       </w:tr>
       <w:tr>
-        <w:tblPrEx>
-          <w:tblCellMar>
-            <w:top w:w="0" w:type="dxa"/>
-            <w:bottom w:w="0" w:type="dxa"/>
-          </w:tblCellMar>
-        </w:tblPrEx>
         <w:tc>
           <w:tcPr>
             <w:tcW w:w="2800" w:type="dxa"/>
@@ -9174,12 +8959,6 @@
         </w:tc>
       </w:tr>
       <w:tr>
-        <w:tblPrEx>
-          <w:tblCellMar>
-            <w:top w:w="0" w:type="dxa"/>
-            <w:bottom w:w="0" w:type="dxa"/>
-          </w:tblCellMar>
-        </w:tblPrEx>
         <w:tc>
           <w:tcPr>
             <w:tcW w:w="2800" w:type="dxa"/>
@@ -9239,12 +9018,6 @@
         </w:tc>
       </w:tr>
       <w:tr>
-        <w:tblPrEx>
-          <w:tblCellMar>
-            <w:top w:w="0" w:type="dxa"/>
-            <w:bottom w:w="0" w:type="dxa"/>
-          </w:tblCellMar>
-        </w:tblPrEx>
         <w:tc>
           <w:tcPr>
             <w:tcW w:w="2800" w:type="dxa"/>
@@ -9304,12 +9077,6 @@
         </w:tc>
       </w:tr>
       <w:tr>
-        <w:tblPrEx>
-          <w:tblCellMar>
-            <w:top w:w="0" w:type="dxa"/>
-            <w:bottom w:w="0" w:type="dxa"/>
-          </w:tblCellMar>
-        </w:tblPrEx>
         <w:tc>
           <w:tcPr>
             <w:tcW w:w="2800" w:type="dxa"/>
@@ -9369,12 +9136,6 @@
         </w:tc>
       </w:tr>
       <w:tr>
-        <w:tblPrEx>
-          <w:tblCellMar>
-            <w:top w:w="0" w:type="dxa"/>
-            <w:bottom w:w="0" w:type="dxa"/>
-          </w:tblCellMar>
-        </w:tblPrEx>
         <w:tc>
           <w:tcPr>
             <w:tcW w:w="2800" w:type="dxa"/>
@@ -9434,12 +9195,6 @@
         </w:tc>
       </w:tr>
       <w:tr>
-        <w:tblPrEx>
-          <w:tblCellMar>
-            <w:top w:w="0" w:type="dxa"/>
-            <w:bottom w:w="0" w:type="dxa"/>
-          </w:tblCellMar>
-        </w:tblPrEx>
         <w:tc>
           <w:tcPr>
             <w:tcW w:w="2800" w:type="dxa"/>
@@ -9499,12 +9254,6 @@
         </w:tc>
       </w:tr>
       <w:tr>
-        <w:tblPrEx>
-          <w:tblCellMar>
-            <w:top w:w="0" w:type="dxa"/>
-            <w:bottom w:w="0" w:type="dxa"/>
-          </w:tblCellMar>
-        </w:tblPrEx>
         <w:tc>
           <w:tcPr>
             <w:tcW w:w="2800" w:type="dxa"/>
@@ -9564,12 +9313,6 @@
         </w:tc>
       </w:tr>
       <w:tr>
-        <w:tblPrEx>
-          <w:tblCellMar>
-            <w:top w:w="0" w:type="dxa"/>
-            <w:bottom w:w="0" w:type="dxa"/>
-          </w:tblCellMar>
-        </w:tblPrEx>
         <w:tc>
           <w:tcPr>
             <w:tcW w:w="2800" w:type="dxa"/>
@@ -10124,12 +9867,6 @@
         <w:gridCol w:w="6960"/>
       </w:tblGrid>
       <w:tr>
-        <w:tblPrEx>
-          <w:tblCellMar>
-            <w:top w:w="0" w:type="dxa"/>
-            <w:bottom w:w="0" w:type="dxa"/>
-          </w:tblCellMar>
-        </w:tblPrEx>
         <w:tc>
           <w:tcPr>
             <w:tcW w:w="2400" w:type="dxa"/>
@@ -10192,12 +9929,6 @@
         </w:tc>
       </w:tr>
       <w:tr>
-        <w:tblPrEx>
-          <w:tblCellMar>
-            <w:top w:w="0" w:type="dxa"/>
-            <w:bottom w:w="0" w:type="dxa"/>
-          </w:tblCellMar>
-        </w:tblPrEx>
         <w:tc>
           <w:tcPr>
             <w:tcW w:w="2400" w:type="dxa"/>
@@ -10256,12 +9987,6 @@
         </w:tc>
       </w:tr>
       <w:tr>
-        <w:tblPrEx>
-          <w:tblCellMar>
-            <w:top w:w="0" w:type="dxa"/>
-            <w:bottom w:w="0" w:type="dxa"/>
-          </w:tblCellMar>
-        </w:tblPrEx>
         <w:tc>
           <w:tcPr>
             <w:tcW w:w="2400" w:type="dxa"/>
@@ -10320,12 +10045,6 @@
         </w:tc>
       </w:tr>
       <w:tr>
-        <w:tblPrEx>
-          <w:tblCellMar>
-            <w:top w:w="0" w:type="dxa"/>
-            <w:bottom w:w="0" w:type="dxa"/>
-          </w:tblCellMar>
-        </w:tblPrEx>
         <w:tc>
           <w:tcPr>
             <w:tcW w:w="2400" w:type="dxa"/>
@@ -10384,12 +10103,6 @@
         </w:tc>
       </w:tr>
       <w:tr>
-        <w:tblPrEx>
-          <w:tblCellMar>
-            <w:top w:w="0" w:type="dxa"/>
-            <w:bottom w:w="0" w:type="dxa"/>
-          </w:tblCellMar>
-        </w:tblPrEx>
         <w:tc>
           <w:tcPr>
             <w:tcW w:w="2400" w:type="dxa"/>
@@ -10448,12 +10161,6 @@
         </w:tc>
       </w:tr>
       <w:tr>
-        <w:tblPrEx>
-          <w:tblCellMar>
-            <w:top w:w="0" w:type="dxa"/>
-            <w:bottom w:w="0" w:type="dxa"/>
-          </w:tblCellMar>
-        </w:tblPrEx>
         <w:tc>
           <w:tcPr>
             <w:tcW w:w="2400" w:type="dxa"/>
@@ -10550,12 +10257,6 @@
         <w:gridCol w:w="5040"/>
       </w:tblGrid>
       <w:tr>
-        <w:tblPrEx>
-          <w:tblCellMar>
-            <w:top w:w="0" w:type="dxa"/>
-            <w:bottom w:w="0" w:type="dxa"/>
-          </w:tblCellMar>
-        </w:tblPrEx>
         <w:tc>
           <w:tcPr>
             <w:tcW w:w="1440" w:type="dxa"/>
@@ -10648,12 +10349,6 @@
         </w:tc>
       </w:tr>
       <w:tr>
-        <w:tblPrEx>
-          <w:tblCellMar>
-            <w:top w:w="0" w:type="dxa"/>
-            <w:bottom w:w="0" w:type="dxa"/>
-          </w:tblCellMar>
-        </w:tblPrEx>
         <w:tc>
           <w:tcPr>
             <w:tcW w:w="1440" w:type="dxa"/>
@@ -10742,12 +10437,6 @@
         </w:tc>
       </w:tr>
       <w:tr>
-        <w:tblPrEx>
-          <w:tblCellMar>
-            <w:top w:w="0" w:type="dxa"/>
-            <w:bottom w:w="0" w:type="dxa"/>
-          </w:tblCellMar>
-        </w:tblPrEx>
         <w:tc>
           <w:tcPr>
             <w:tcW w:w="1440" w:type="dxa"/>
@@ -10836,12 +10525,6 @@
         </w:tc>
       </w:tr>
       <w:tr>
-        <w:tblPrEx>
-          <w:tblCellMar>
-            <w:top w:w="0" w:type="dxa"/>
-            <w:bottom w:w="0" w:type="dxa"/>
-          </w:tblCellMar>
-        </w:tblPrEx>
         <w:tc>
           <w:tcPr>
             <w:tcW w:w="1440" w:type="dxa"/>
@@ -10930,12 +10613,6 @@
         </w:tc>
       </w:tr>
       <w:tr>
-        <w:tblPrEx>
-          <w:tblCellMar>
-            <w:top w:w="0" w:type="dxa"/>
-            <w:bottom w:w="0" w:type="dxa"/>
-          </w:tblCellMar>
-        </w:tblPrEx>
         <w:tc>
           <w:tcPr>
             <w:tcW w:w="1440" w:type="dxa"/>

</xml_diff>